<commit_message>
fix: close external review handoff contract
</commit_message>
<xml_diff>
--- a/docs/paper_artifacts/final/deliverables/POI_MPP_EVIDENCE_BOUND_MANUSCRIPT.docx
+++ b/docs/paper_artifacts/final/deliverables/POI_MPP_EVIDENCE_BOUND_MANUSCRIPT.docx
@@ -39,8 +39,6 @@
         <w:pBdr>
           <w:top w:val="single" w:color="D6B656" w:sz="6"/>
           <w:bottom w:val="single" w:color="D6B656" w:sz="6"/>
-          <w:left w:val="single" w:color="D6B656" w:sz="6"/>
-          <w:right w:val="single" w:color="D6B656" w:sz="6"/>
         </w:pBdr>
         <w:shd w:fill="FFF2CC" w:val="clear"/>
         <w:spacing w:after="240" w:before="240"/>
@@ -83,7 +81,7 @@
           <w:sz w:val="17"/>
           <w:szCs w:val="17"/>
         </w:rPr>
-        <w:t xml:space="preserve">416c4fd909e10304c361af056f0fddbc3ab47c67aeedad8f22fb69d839801e49</w:t>
+        <w:t xml:space="preserve">7177d57747304d003160cdcb45bd572337028a8ffed8793dfa57e2d1444aaabf</w:t>
       </w:r>
     </w:p>
     <w:p>
@@ -4619,7 +4617,7 @@
           <w:color w:val="1F4E5F"/>
           <w:shd w:fill="E9F2F4" w:val="clear"/>
         </w:rPr>
-        <w:t xml:space="preserve">416c4fd909e10304c361af056f0fddbc3ab47c67aeedad8f22fb69d839801e49</w:t>
+        <w:t xml:space="preserve">7177d57747304d003160cdcb45bd572337028a8ffed8793dfa57e2d1444aaabf</w:t>
       </w:r>
       <w:r>
         <w:t xml:space="preserve">. It contains machine-readable tables, quantitative SVG and JSON outputs, the claim matrix, and the omission ledger. Conceptual diagrams are retained as editable Mermaid source, and Algorithms 1-5 are retained as manuscript-ready pseudocode and detailed source specifications. Paper-only PNGs are deterministic presentation derivatives generated from canonical figure JSON by </w:t>

</xml_diff>

<commit_message>
feat: harden publication artifact handoff
</commit_message>
<xml_diff>
--- a/docs/paper_artifacts/final/deliverables/POI_MPP_EVIDENCE_BOUND_MANUSCRIPT.docx
+++ b/docs/paper_artifacts/final/deliverables/POI_MPP_EVIDENCE_BOUND_MANUSCRIPT.docx
@@ -158,7 +158,7 @@
         <w:spacing w:after="120" w:line="280"/>
       </w:pPr>
       <w:r>
-        <w:t xml:space="preserve">The proposed answer is Single-Pass Auditable Intelligence (SPAI): one committed response, one model execution, one set of committed execution and semantic audit surfaces, one post-commit randomized audit process, and one maturity rule that converts only successfully audited events into bounded protocol authority. The architectural goal is not to claim novelty for optimistic fraud proofs [1,2], algebraic matrix checks [6], remote attestation [3,4,7], data-availability sampling [13], zero-knowledge machine-learning verification [9,10], or weighted Byzantine fault tolerance [14] in isolation. The architectural claim is narrower: these components can be composed into a complete PoI path that avoids two common-path cost barriers while preserving explicit failure states and assurance tiers.</w:t>
+        <w:t xml:space="preserve">The proposed answer is Single-Pass Auditable Intelligence (SPAI): one committed response, one model execution, one set of committed execution and semantic audit surfaces, one post-commit randomized audit process, and one maturity rule that converts only successfully audited events into bounded protocol authority. The architectural goal is not to claim novelty for optimistic fraud proofs [1,2], algebraic matrix checks [6], remote attestation [3,4,7], data-availability sampling [11], zero-knowledge machine-learning verification [9,10], or weighted Byzantine fault tolerance [12] in isolation. The architectural claim is narrower: these components can be composed into a complete PoI path that avoids two common-path cost barriers while preserving explicit failure states and assurance tiers.</w:t>
       </w:r>
     </w:p>
     <w:p>
@@ -373,7 +373,6 @@
         <w:rPr>
           <w:rFonts w:ascii="Courier New" w:cs="Courier New" w:eastAsia="Courier New" w:hAnsi="Courier New"/>
           <w:color w:val="1F4E5F"/>
-          <w:shd w:fill="E9F2F4" w:val="clear"/>
         </w:rPr>
         <w:t xml:space="preserve">docs/diagrams/D1_system_architecture.mmd</w:t>
       </w:r>
@@ -391,7 +390,6 @@
         <w:rPr>
           <w:rFonts w:ascii="Courier New" w:cs="Courier New" w:eastAsia="Courier New" w:hAnsi="Courier New"/>
           <w:color w:val="1F4E5F"/>
-          <w:shd w:fill="E9F2F4" w:val="clear"/>
         </w:rPr>
         <w:t xml:space="preserve">docs/diagrams/D2_spai_sequence.mmd</w:t>
       </w:r>
@@ -409,7 +407,6 @@
         <w:rPr>
           <w:rFonts w:ascii="Courier New" w:cs="Courier New" w:eastAsia="Courier New" w:hAnsi="Courier New"/>
           <w:color w:val="1F4E5F"/>
-          <w:shd w:fill="E9F2F4" w:val="clear"/>
         </w:rPr>
         <w:t xml:space="preserve">docs/diagrams/D3_receipt_state.mmd</w:t>
       </w:r>
@@ -427,7 +424,6 @@
         <w:rPr>
           <w:rFonts w:ascii="Courier New" w:cs="Courier New" w:eastAsia="Courier New" w:hAnsi="Courier New"/>
           <w:color w:val="1F4E5F"/>
-          <w:shd w:fill="E9F2F4" w:val="clear"/>
         </w:rPr>
         <w:t xml:space="preserve">docs/diagrams/D4_audit_compiler.mmd</w:t>
       </w:r>
@@ -445,7 +441,6 @@
         <w:rPr>
           <w:rFonts w:ascii="Courier New" w:cs="Courier New" w:eastAsia="Courier New" w:hAnsi="Courier New"/>
           <w:color w:val="1F4E5F"/>
-          <w:shd w:fill="E9F2F4" w:val="clear"/>
         </w:rPr>
         <w:t xml:space="preserve">docs/diagrams/D5_economic_flow.mmd</w:t>
       </w:r>
@@ -463,7 +458,6 @@
         <w:rPr>
           <w:rFonts w:ascii="Courier New" w:cs="Courier New" w:eastAsia="Courier New" w:hAnsi="Courier New"/>
           <w:color w:val="1F4E5F"/>
-          <w:shd w:fill="E9F2F4" w:val="clear"/>
         </w:rPr>
         <w:t xml:space="preserve">docs/diagrams/D6_semantic_audit.mmd</w:t>
       </w:r>
@@ -481,7 +475,6 @@
         <w:rPr>
           <w:rFonts w:ascii="Courier New" w:cs="Courier New" w:eastAsia="Courier New" w:hAnsi="Courier New"/>
           <w:color w:val="1F4E5F"/>
-          <w:shd w:fill="E9F2F4" w:val="clear"/>
         </w:rPr>
         <w:t xml:space="preserve">docs/algorithms/A1_SPAI.md</w:t>
       </w:r>
@@ -499,7 +492,6 @@
         <w:rPr>
           <w:rFonts w:ascii="Courier New" w:cs="Courier New" w:eastAsia="Courier New" w:hAnsi="Courier New"/>
           <w:color w:val="1F4E5F"/>
-          <w:shd w:fill="E9F2F4" w:val="clear"/>
         </w:rPr>
         <w:t xml:space="preserve">docs/algorithms/A2_AuditCompiler.md</w:t>
       </w:r>
@@ -517,7 +509,6 @@
         <w:rPr>
           <w:rFonts w:ascii="Courier New" w:cs="Courier New" w:eastAsia="Courier New" w:hAnsi="Courier New"/>
           <w:color w:val="1F4E5F"/>
-          <w:shd w:fill="E9F2F4" w:val="clear"/>
         </w:rPr>
         <w:t xml:space="preserve">docs/algorithms/A3_VerifySPAIEvent.md</w:t>
       </w:r>
@@ -535,7 +526,6 @@
         <w:rPr>
           <w:rFonts w:ascii="Courier New" w:cs="Courier New" w:eastAsia="Courier New" w:hAnsi="Courier New"/>
           <w:color w:val="1F4E5F"/>
-          <w:shd w:fill="E9F2F4" w:val="clear"/>
         </w:rPr>
         <w:t xml:space="preserve">docs/algorithms/A4_PoI_Credit.md</w:t>
       </w:r>
@@ -553,7 +543,6 @@
         <w:rPr>
           <w:rFonts w:ascii="Courier New" w:cs="Courier New" w:eastAsia="Courier New" w:hAnsi="Courier New"/>
           <w:color w:val="1F4E5F"/>
-          <w:shd w:fill="E9F2F4" w:val="clear"/>
         </w:rPr>
         <w:t xml:space="preserve">docs/algorithms/A5_Optimistic_Dispute.md</w:t>
       </w:r>
@@ -806,7 +795,6 @@
         <w:rPr>
           <w:rFonts w:ascii="Courier New" w:cs="Courier New" w:eastAsia="Courier New" w:hAnsi="Courier New"/>
           <w:color w:val="1F4E5F"/>
-          <w:shd w:fill="E9F2F4" w:val="clear"/>
         </w:rPr>
         <w:t xml:space="preserve">SYNTHETIC_NON_EVIDENCE</w:t>
       </w:r>
@@ -920,7 +908,6 @@
     </w:p>
     <w:p>
       <w:pPr>
-        <w:keepNext/>
         <w:spacing w:after="180"/>
         <w:jc w:val="center"/>
       </w:pPr>
@@ -962,7 +949,6 @@
         <w:rPr>
           <w:rFonts w:ascii="Courier New" w:cs="Courier New" w:eastAsia="Courier New" w:hAnsi="Courier New"/>
           <w:color w:val="1F4E5F"/>
-          <w:shd w:fill="E9F2F4" w:val="clear"/>
         </w:rPr>
         <w:t xml:space="preserve">task -&gt; execute once -&gt; trace + Intelligence Evidence Capsule -&gt; commitment -&gt; post-commit audit -&gt; challenge or DA gate -&gt; matured receipt -&gt; next-epoch weight</w:t>
       </w:r>
@@ -1025,7 +1011,6 @@
     </w:p>
     <w:p>
       <w:pPr>
-        <w:keepNext/>
         <w:spacing w:after="180"/>
         <w:jc w:val="center"/>
       </w:pPr>
@@ -1448,7 +1433,6 @@
     </w:p>
     <w:p>
       <w:pPr>
-        <w:keepNext/>
         <w:spacing w:after="180"/>
         <w:jc w:val="center"/>
       </w:pPr>
@@ -1958,7 +1942,6 @@
         <w:rPr>
           <w:rFonts w:ascii="Courier New" w:cs="Courier New" w:eastAsia="Courier New" w:hAnsi="Courier New"/>
           <w:color w:val="1F4E5F"/>
-          <w:shd w:fill="E9F2F4" w:val="clear"/>
         </w:rPr>
         <w:t xml:space="preserve">raw data -&gt; aggregation script -&gt; table or figure artifact -&gt; manuscript</w:t>
       </w:r>
@@ -1994,7 +1977,6 @@
         <w:rPr>
           <w:rFonts w:ascii="Courier New" w:cs="Courier New" w:eastAsia="Courier New" w:hAnsi="Courier New"/>
           <w:color w:val="1F4E5F"/>
-          <w:shd w:fill="E9F2F4" w:val="clear"/>
         </w:rPr>
         <w:t xml:space="preserve">README.md</w:t>
       </w:r>
@@ -2012,7 +1994,6 @@
         <w:rPr>
           <w:rFonts w:ascii="Courier New" w:cs="Courier New" w:eastAsia="Courier New" w:hAnsi="Courier New"/>
           <w:color w:val="1F4E5F"/>
-          <w:shd w:fill="E9F2F4" w:val="clear"/>
         </w:rPr>
         <w:t xml:space="preserve">docs/EXPERIMENT_PLAN.md</w:t>
       </w:r>
@@ -2030,7 +2011,6 @@
         <w:rPr>
           <w:rFonts w:ascii="Courier New" w:cs="Courier New" w:eastAsia="Courier New" w:hAnsi="Courier New"/>
           <w:color w:val="1F4E5F"/>
-          <w:shd w:fill="E9F2F4" w:val="clear"/>
         </w:rPr>
         <w:t xml:space="preserve">docs/EXPERIMENT_ARTIFACT_MATRIX.md</w:t>
       </w:r>
@@ -2048,7 +2028,6 @@
         <w:rPr>
           <w:rFonts w:ascii="Courier New" w:cs="Courier New" w:eastAsia="Courier New" w:hAnsi="Courier New"/>
           <w:color w:val="1F4E5F"/>
-          <w:shd w:fill="E9F2F4" w:val="clear"/>
         </w:rPr>
         <w:t xml:space="preserve">docs/ARTIFACT_COLLECTION_GUIDE.md</w:t>
       </w:r>
@@ -2066,7 +2045,6 @@
         <w:rPr>
           <w:rFonts w:ascii="Courier New" w:cs="Courier New" w:eastAsia="Courier New" w:hAnsi="Courier New"/>
           <w:color w:val="1F4E5F"/>
-          <w:shd w:fill="E9F2F4" w:val="clear"/>
         </w:rPr>
         <w:t xml:space="preserve">docs/PAPER_ARTIFACT_MAP.md</w:t>
       </w:r>
@@ -2084,7 +2062,6 @@
         <w:rPr>
           <w:rFonts w:ascii="Courier New" w:cs="Courier New" w:eastAsia="Courier New" w:hAnsi="Courier New"/>
           <w:color w:val="1F4E5F"/>
-          <w:shd w:fill="E9F2F4" w:val="clear"/>
         </w:rPr>
         <w:t xml:space="preserve">docs/MAIN_RESULTS_TARGETS.md</w:t>
       </w:r>
@@ -2128,7 +2105,6 @@
         <w:rPr>
           <w:rFonts w:ascii="Courier New" w:cs="Courier New" w:eastAsia="Courier New" w:hAnsi="Courier New"/>
           <w:color w:val="1F4E5F"/>
-          <w:shd w:fill="E9F2F4" w:val="clear"/>
         </w:rPr>
         <w:t xml:space="preserve">WAITING_EXTERNAL</w:t>
       </w:r>
@@ -2157,7 +2133,6 @@
         <w:rPr>
           <w:rFonts w:ascii="Courier New" w:cs="Courier New" w:eastAsia="Courier New" w:hAnsi="Courier New"/>
           <w:color w:val="1F4E5F"/>
-          <w:shd w:fill="E9F2F4" w:val="clear"/>
         </w:rPr>
         <w:t xml:space="preserve">docs/EXPERIMENT_PLAN.md</w:t>
       </w:r>
@@ -2168,7 +2143,6 @@
         <w:rPr>
           <w:rFonts w:ascii="Courier New" w:cs="Courier New" w:eastAsia="Courier New" w:hAnsi="Courier New"/>
           <w:color w:val="1F4E5F"/>
-          <w:shd w:fill="E9F2F4" w:val="clear"/>
         </w:rPr>
         <w:t xml:space="preserve">docs/EXPERIMENT_ARTIFACT_MATRIX.md</w:t>
       </w:r>
@@ -2179,7 +2153,6 @@
         <w:rPr>
           <w:rFonts w:ascii="Courier New" w:cs="Courier New" w:eastAsia="Courier New" w:hAnsi="Courier New"/>
           <w:color w:val="1F4E5F"/>
-          <w:shd w:fill="E9F2F4" w:val="clear"/>
         </w:rPr>
         <w:t xml:space="preserve">docs/ARTIFACT_COLLECTION_GUIDE.md</w:t>
       </w:r>
@@ -2278,7 +2251,6 @@
         <w:rPr>
           <w:rFonts w:ascii="Courier New" w:cs="Courier New" w:eastAsia="Courier New" w:hAnsi="Courier New"/>
           <w:color w:val="1F4E5F"/>
-          <w:shd w:fill="E9F2F4" w:val="clear"/>
         </w:rPr>
         <w:t xml:space="preserve">INCONCLUSIVE</w:t>
       </w:r>
@@ -2289,7 +2261,6 @@
         <w:rPr>
           <w:rFonts w:ascii="Courier New" w:cs="Courier New" w:eastAsia="Courier New" w:hAnsi="Courier New"/>
           <w:color w:val="1F4E5F"/>
-          <w:shd w:fill="E9F2F4" w:val="clear"/>
         </w:rPr>
         <w:t xml:space="preserve">INCONCLUSIVE</w:t>
       </w:r>
@@ -2300,7 +2271,6 @@
         <w:rPr>
           <w:rFonts w:ascii="Courier New" w:cs="Courier New" w:eastAsia="Courier New" w:hAnsi="Courier New"/>
           <w:color w:val="1F4E5F"/>
-          <w:shd w:fill="E9F2F4" w:val="clear"/>
         </w:rPr>
         <w:t xml:space="preserve">WAITING_EXTERNAL</w:t>
       </w:r>
@@ -2311,7 +2281,6 @@
         <w:rPr>
           <w:rFonts w:ascii="Courier New" w:cs="Courier New" w:eastAsia="Courier New" w:hAnsi="Courier New"/>
           <w:color w:val="1F4E5F"/>
-          <w:shd w:fill="E9F2F4" w:val="clear"/>
         </w:rPr>
         <w:t xml:space="preserve">INCONCLUSIVE</w:t>
       </w:r>
@@ -2322,7 +2291,6 @@
         <w:rPr>
           <w:rFonts w:ascii="Courier New" w:cs="Courier New" w:eastAsia="Courier New" w:hAnsi="Courier New"/>
           <w:color w:val="1F4E5F"/>
-          <w:shd w:fill="E9F2F4" w:val="clear"/>
         </w:rPr>
         <w:t xml:space="preserve">SUPPORTED</w:t>
       </w:r>
@@ -2333,7 +2301,6 @@
         <w:rPr>
           <w:rFonts w:ascii="Courier New" w:cs="Courier New" w:eastAsia="Courier New" w:hAnsi="Courier New"/>
           <w:color w:val="1F4E5F"/>
-          <w:shd w:fill="E9F2F4" w:val="clear"/>
         </w:rPr>
         <w:t xml:space="preserve">SUPPORTED</w:t>
       </w:r>
@@ -2344,7 +2311,6 @@
         <w:rPr>
           <w:rFonts w:ascii="Courier New" w:cs="Courier New" w:eastAsia="Courier New" w:hAnsi="Courier New"/>
           <w:color w:val="1F4E5F"/>
-          <w:shd w:fill="E9F2F4" w:val="clear"/>
         </w:rPr>
         <w:t xml:space="preserve">SUPPORTED</w:t>
       </w:r>
@@ -2355,7 +2321,6 @@
         <w:rPr>
           <w:rFonts w:ascii="Courier New" w:cs="Courier New" w:eastAsia="Courier New" w:hAnsi="Courier New"/>
           <w:color w:val="1F4E5F"/>
-          <w:shd w:fill="E9F2F4" w:val="clear"/>
         </w:rPr>
         <w:t xml:space="preserve">INCONCLUSIVE</w:t>
       </w:r>
@@ -2630,7 +2595,6 @@
                 <w:color w:val="1F4E5F"/>
                 <w:sz w:val="18"/>
                 <w:szCs w:val="18"/>
-                <w:shd w:fill="E9F2F4" w:val="clear"/>
               </w:rPr>
               <w:t xml:space="preserve">INCONCLUSIVE</w:t>
             </w:r>
@@ -2768,7 +2732,6 @@
                 <w:color w:val="1F4E5F"/>
                 <w:sz w:val="18"/>
                 <w:szCs w:val="18"/>
-                <w:shd w:fill="E9F2F4" w:val="clear"/>
               </w:rPr>
               <w:t xml:space="preserve">INCONCLUSIVE</w:t>
             </w:r>
@@ -2903,7 +2866,6 @@
                 <w:color w:val="1F4E5F"/>
                 <w:sz w:val="18"/>
                 <w:szCs w:val="18"/>
-                <w:shd w:fill="E9F2F4" w:val="clear"/>
               </w:rPr>
               <w:t xml:space="preserve">WAITING_EXTERNAL</w:t>
             </w:r>
@@ -3041,7 +3003,6 @@
                 <w:color w:val="1F4E5F"/>
                 <w:sz w:val="18"/>
                 <w:szCs w:val="18"/>
-                <w:shd w:fill="E9F2F4" w:val="clear"/>
               </w:rPr>
               <w:t xml:space="preserve">INCONCLUSIVE</w:t>
             </w:r>
@@ -3176,7 +3137,6 @@
                 <w:color w:val="1F4E5F"/>
                 <w:sz w:val="18"/>
                 <w:szCs w:val="18"/>
-                <w:shd w:fill="E9F2F4" w:val="clear"/>
               </w:rPr>
               <w:t xml:space="preserve">SUPPORTED</w:t>
             </w:r>
@@ -3314,7 +3274,6 @@
                 <w:color w:val="1F4E5F"/>
                 <w:sz w:val="18"/>
                 <w:szCs w:val="18"/>
-                <w:shd w:fill="E9F2F4" w:val="clear"/>
               </w:rPr>
               <w:t xml:space="preserve">SUPPORTED</w:t>
             </w:r>
@@ -3449,7 +3408,6 @@
                 <w:color w:val="1F4E5F"/>
                 <w:sz w:val="18"/>
                 <w:szCs w:val="18"/>
-                <w:shd w:fill="E9F2F4" w:val="clear"/>
               </w:rPr>
               <w:t xml:space="preserve">SUPPORTED</w:t>
             </w:r>
@@ -3587,7 +3545,6 @@
                 <w:color w:val="1F4E5F"/>
                 <w:sz w:val="18"/>
                 <w:szCs w:val="18"/>
-                <w:shd w:fill="E9F2F4" w:val="clear"/>
               </w:rPr>
               <w:t xml:space="preserve">INCONCLUSIVE</w:t>
             </w:r>
@@ -3647,7 +3604,6 @@
         <w:rPr>
           <w:rFonts w:ascii="Courier New" w:cs="Courier New" w:eastAsia="Courier New" w:hAnsi="Courier New"/>
           <w:color w:val="1F4E5F"/>
-          <w:shd w:fill="E9F2F4" w:val="clear"/>
         </w:rPr>
         <w:t xml:space="preserve">INCONCLUSIVE</w:t>
       </w:r>
@@ -3704,7 +3660,6 @@
     </w:p>
     <w:p>
       <w:pPr>
-        <w:keepNext/>
         <w:spacing w:after="180"/>
         <w:jc w:val="center"/>
       </w:pPr>
@@ -3731,7 +3686,6 @@
         <w:rPr>
           <w:rFonts w:ascii="Courier New" w:cs="Courier New" w:eastAsia="Courier New" w:hAnsi="Courier New"/>
           <w:color w:val="1F4E5F"/>
-          <w:shd w:fill="E9F2F4" w:val="clear"/>
         </w:rPr>
         <w:t xml:space="preserve">INCONCLUSIVE</w:t>
       </w:r>
@@ -3788,7 +3742,6 @@
     </w:p>
     <w:p>
       <w:pPr>
-        <w:keepNext/>
         <w:spacing w:after="180"/>
         <w:jc w:val="center"/>
       </w:pPr>
@@ -3824,7 +3777,6 @@
         <w:rPr>
           <w:rFonts w:ascii="Courier New" w:cs="Courier New" w:eastAsia="Courier New" w:hAnsi="Courier New"/>
           <w:color w:val="1F4E5F"/>
-          <w:shd w:fill="E9F2F4" w:val="clear"/>
         </w:rPr>
         <w:t xml:space="preserve">WAITING_EXTERNAL</w:t>
       </w:r>
@@ -3844,7 +3796,6 @@
         <w:rPr>
           <w:rFonts w:ascii="Courier New" w:cs="Courier New" w:eastAsia="Courier New" w:hAnsi="Courier New"/>
           <w:color w:val="1F4E5F"/>
-          <w:shd w:fill="E9F2F4" w:val="clear"/>
         </w:rPr>
         <w:t xml:space="preserve">INCONCLUSIVE</w:t>
       </w:r>
@@ -3855,7 +3806,6 @@
         <w:rPr>
           <w:rFonts w:ascii="Courier New" w:cs="Courier New" w:eastAsia="Courier New" w:hAnsi="Courier New"/>
           <w:color w:val="1F4E5F"/>
-          <w:shd w:fill="E9F2F4" w:val="clear"/>
         </w:rPr>
         <w:t xml:space="preserve">SUPPORTED</w:t>
       </w:r>
@@ -3866,7 +3816,6 @@
         <w:rPr>
           <w:rFonts w:ascii="Courier New" w:cs="Courier New" w:eastAsia="Courier New" w:hAnsi="Courier New"/>
           <w:color w:val="1F4E5F"/>
-          <w:shd w:fill="E9F2F4" w:val="clear"/>
         </w:rPr>
         <w:t xml:space="preserve">SUPPORTED</w:t>
       </w:r>
@@ -3885,7 +3834,7 @@
           <wp:inline distT="0" distB="0" distL="0" distR="0">
             <wp:extent cx="5715000" cy="3467100"/>
             <wp:effectExtent t="0" r="0" b="0" l="0"/>
-            <wp:docPr id="1" name="F9_sybil_advantage.png" descr="Figure 9. E6 identity-splitting simulation. Capacity-committed and operator-slot rules remain normalized at one across the frozen one- and 64-identity scenarios; the intentionally identity-uniform negative control increases to 3.704. This is simulation evidence only." title="Figure 9. E6 identity-splitting simulation. Capacity-committed and operator-slot rules remain normalized at one across the frozen one- and 64-identity scenarios; the intentionally identity-uniform negative control increases to 3.704. This is simulation evidence only."/>
+            <wp:docPr id="1" name="F8_da_withholding.png" descr="Figure 8. E4 declared data-availability playback. The two scenario values and interval bounds are reproducible simulation outputs, not executed reconstruction or production DA evidence. The experiment remains INCONCLUSIVE." title="Figure 8. E4 declared data-availability playback. The two scenario values and interval bounds are reproducible simulation outputs, not executed reconstruction or production DA evidence. The experiment remains INCONCLUSIVE."/>
             <wp:cNvGraphicFramePr>
               <a:graphicFrameLocks xmlns:a="http://schemas.openxmlformats.org/drawingml/2006/main" noChangeAspect="1"/>
             </wp:cNvGraphicFramePr>
@@ -3923,7 +3872,6 @@
     </w:p>
     <w:p>
       <w:pPr>
-        <w:keepNext/>
         <w:spacing w:after="180"/>
         <w:jc w:val="center"/>
       </w:pPr>
@@ -3935,7 +3883,7 @@
           <w:sz w:val="18"/>
           <w:szCs w:val="18"/>
         </w:rPr>
-        <w:t xml:space="preserve">Figure 9. E6 identity-splitting simulation. Capacity-committed and operator-slot rules remain normalized at one across the frozen one- and 64-identity scenarios; the intentionally identity-uniform negative control increases to 3.704. This is simulation evidence only.</w:t>
+        <w:t xml:space="preserve">Figure 8. E4 declared data-availability playback. The two scenario values and interval bounds are reproducible simulation outputs, not executed reconstruction or production DA evidence. The experiment remains INCONCLUSIVE.</w:t>
       </w:r>
     </w:p>
     <w:p>
@@ -3949,7 +3897,7 @@
           <wp:inline distT="0" distB="0" distL="0" distR="0">
             <wp:extent cx="5715000" cy="3467100"/>
             <wp:effectExtent t="0" r="0" b="0" l="0"/>
-            <wp:docPr id="1" name="F10_economic_security.png" descr="Figure 10. E6 modeled cost to one-third target weight under the frozen scenarios. Values are reproducible simulation outputs, not market prices, field measurements, or a production attack-cost guarantee." title="Figure 10. E6 modeled cost to one-third target weight under the frozen scenarios. Values are reproducible simulation outputs, not market prices, field measurements, or a production attack-cost guarantee."/>
+            <wp:docPr id="1" name="F9_sybil_advantage.png" descr="Figure 9. E6 identity-splitting simulation. Capacity-committed and operator-slot rules remain normalized at one across the frozen one- and 64-identity scenarios; the intentionally identity-uniform negative control increases to 3.704. This is simulation evidence only." title="Figure 9. E6 identity-splitting simulation. Capacity-committed and operator-slot rules remain normalized at one across the frozen one- and 64-identity scenarios; the intentionally identity-uniform negative control increases to 3.704. This is simulation evidence only."/>
             <wp:cNvGraphicFramePr>
               <a:graphicFrameLocks xmlns:a="http://schemas.openxmlformats.org/drawingml/2006/main" noChangeAspect="1"/>
             </wp:cNvGraphicFramePr>
@@ -3987,7 +3935,6 @@
     </w:p>
     <w:p>
       <w:pPr>
-        <w:keepNext/>
         <w:spacing w:after="180"/>
         <w:jc w:val="center"/>
       </w:pPr>
@@ -3999,47 +3946,7 @@
           <w:sz w:val="18"/>
           <w:szCs w:val="18"/>
         </w:rPr>
-        <w:t xml:space="preserve">Figure 10. E6 modeled cost to one-third target weight under the frozen scenarios. Values are reproducible simulation outputs, not market prices, field measurements, or a production attack-cost guarantee.</w:t>
-      </w:r>
-    </w:p>
-    <w:p>
-      <w:pPr>
-        <w:pStyle w:val="Heading2"/>
-        <w:keepNext/>
-      </w:pPr>
-      <w:r>
-        <w:t xml:space="preserve">6.4 E7 and E8: local measurement and simulation</w:t>
-      </w:r>
-    </w:p>
-    <w:p>
-      <w:pPr>
-        <w:widowControl/>
-        <w:spacing w:after="120" w:line="280"/>
-      </w:pPr>
-      <w:r>
-        <w:t xml:space="preserve">E7 (T12, F12) contains 15 </w:t>
-      </w:r>
-      <w:r>
-        <w:rPr>
-          <w:rFonts w:ascii="Courier New" w:cs="Courier New" w:eastAsia="Courier New" w:hAnsi="Courier New"/>
-          <w:color w:val="1F4E5F"/>
-          <w:shd w:fill="E9F2F4" w:val="clear"/>
-        </w:rPr>
-        <w:t xml:space="preserve">SUPPORTED</w:t>
-      </w:r>
-      <w:r>
-        <w:t xml:space="preserve"> local Foundry measurements. The largest observed gas value is 467937 for </w:t>
-      </w:r>
-      <w:r>
-        <w:rPr>
-          <w:rFonts w:ascii="Courier New" w:cs="Courier New" w:eastAsia="Courier New" w:hAnsi="Courier New"/>
-          <w:color w:val="1F4E5F"/>
-          <w:shd w:fill="E9F2F4" w:val="clear"/>
-        </w:rPr>
-        <w:t xml:space="preserve">CREDIT_ALLOCATE</w:t>
-      </w:r>
-      <w:r>
-        <w:t xml:space="preserve"> at batch size 8, and the maximum fraction of the configured block limit is 0.00043580029159784317. This supports local boundedness only; it does not establish Ethereum-mainnet economics, production throughput, or production consensus performance.</w:t>
+        <w:t xml:space="preserve">Figure 9. E6 identity-splitting simulation. Capacity-committed and operator-slot rules remain normalized at one across the frozen one- and 64-identity scenarios; the intentionally identity-uniform negative control increases to 3.704. This is simulation evidence only.</w:t>
       </w:r>
     </w:p>
     <w:p>
@@ -4051,9 +3958,9 @@
       <w:r>
         <w:drawing>
           <wp:inline distT="0" distB="0" distL="0" distR="0">
-            <wp:extent cx="5715000" cy="2886075"/>
+            <wp:extent cx="5715000" cy="3467100"/>
             <wp:effectExtent t="0" r="0" b="0" l="0"/>
-            <wp:docPr id="1" name="F12_evm_gas_state_scaling.png" descr="Figure 12. E7 local Foundry gas measurements. The left panel reports batch-size-one operations; the right panel shows credit-allocation scaling through batch size eight. Maximum observed gas is 467,937. This supports local boundedness only." title="Figure 12. E7 local Foundry gas measurements. The left panel reports batch-size-one operations; the right panel shows credit-allocation scaling through batch size eight. Maximum observed gas is 467,937. This supports local boundedness only."/>
+            <wp:docPr id="1" name="F10_economic_security.png" descr="Figure 10. E6 modeled cost to one-third target weight under the frozen scenarios. Values are reproducible simulation outputs, not market prices, field measurements, or a production attack-cost guarantee." title="Figure 10. E6 modeled cost to one-third target weight under the frozen scenarios. Values are reproducible simulation outputs, not market prices, field measurements, or a production attack-cost guarantee."/>
             <wp:cNvGraphicFramePr>
               <a:graphicFrameLocks xmlns:a="http://schemas.openxmlformats.org/drawingml/2006/main" noChangeAspect="1"/>
             </wp:cNvGraphicFramePr>
@@ -4076,6 +3983,107 @@
                   <pic:spPr bwMode="auto">
                     <a:xfrm>
                       <a:off x="0" y="0"/>
+                      <a:ext cx="5715000" cy="3467100"/>
+                    </a:xfrm>
+                    <a:prstGeom prst="rect">
+                      <a:avLst/>
+                    </a:prstGeom>
+                  </pic:spPr>
+                </pic:pic>
+              </a:graphicData>
+            </a:graphic>
+          </wp:inline>
+        </w:drawing>
+      </w:r>
+    </w:p>
+    <w:p>
+      <w:pPr>
+        <w:spacing w:after="180"/>
+        <w:jc w:val="center"/>
+      </w:pPr>
+      <w:r>
+        <w:rPr>
+          <w:i/>
+          <w:iCs/>
+          <w:color w:val="3E4D53"/>
+          <w:sz w:val="18"/>
+          <w:szCs w:val="18"/>
+        </w:rPr>
+        <w:t xml:space="preserve">Figure 10. E6 modeled cost to one-third target weight under the frozen scenarios. Values are reproducible simulation outputs, not market prices, field measurements, or a production attack-cost guarantee.</w:t>
+      </w:r>
+    </w:p>
+    <w:p>
+      <w:pPr>
+        <w:pStyle w:val="Heading2"/>
+        <w:keepNext/>
+      </w:pPr>
+      <w:r>
+        <w:t xml:space="preserve">6.4 E7 and E8: local measurement and simulation</w:t>
+      </w:r>
+    </w:p>
+    <w:p>
+      <w:pPr>
+        <w:widowControl/>
+        <w:spacing w:after="120" w:line="280"/>
+      </w:pPr>
+      <w:r>
+        <w:t xml:space="preserve">E7 (T12, F12) contains 15 </w:t>
+      </w:r>
+      <w:r>
+        <w:rPr>
+          <w:rFonts w:ascii="Courier New" w:cs="Courier New" w:eastAsia="Courier New" w:hAnsi="Courier New"/>
+          <w:color w:val="1F4E5F"/>
+        </w:rPr>
+        <w:t xml:space="preserve">SUPPORTED</w:t>
+      </w:r>
+      <w:r>
+        <w:t xml:space="preserve"> local Foundry measurements. The largest observed gas value is 467937 for </w:t>
+      </w:r>
+      <w:r>
+        <w:rPr>
+          <w:rFonts w:ascii="Courier New" w:cs="Courier New" w:eastAsia="Courier New" w:hAnsi="Courier New"/>
+          <w:color w:val="1F4E5F"/>
+        </w:rPr>
+        <w:t xml:space="preserve">CREDIT_ALLOCATE</w:t>
+      </w:r>
+      <w:r>
+        <w:t xml:space="preserve"> at batch size 8, and the maximum fraction of the configured block limit is 0.00043580029159784317. This supports local boundedness only; it does not establish Ethereum-mainnet economics, production throughput, or production consensus performance.</w:t>
+      </w:r>
+    </w:p>
+    <w:p>
+      <w:pPr>
+        <w:keepNext/>
+        <w:spacing w:after="80" w:before="140"/>
+        <w:jc w:val="center"/>
+      </w:pPr>
+      <w:r>
+        <w:drawing>
+          <wp:inline distT="0" distB="0" distL="0" distR="0">
+            <wp:extent cx="5715000" cy="2886075"/>
+            <wp:effectExtent t="0" r="0" b="0" l="0"/>
+            <wp:docPr id="1" name="F12_evm_gas_state_scaling.png" descr="Figure 12. E7 local Foundry gas measurements. The left panel reports batch-size-one operations; the right panel shows credit-allocation scaling through batch size eight. Maximum observed gas is 467,937. This supports local boundedness only." title="Figure 12. E7 local Foundry gas measurements. The left panel reports batch-size-one operations; the right panel shows credit-allocation scaling through batch size eight. Maximum observed gas is 467,937. This supports local boundedness only."/>
+            <wp:cNvGraphicFramePr>
+              <a:graphicFrameLocks xmlns:a="http://schemas.openxmlformats.org/drawingml/2006/main" noChangeAspect="1"/>
+            </wp:cNvGraphicFramePr>
+            <a:graphic xmlns:a="http://schemas.openxmlformats.org/drawingml/2006/main">
+              <a:graphicData uri="http://schemas.openxmlformats.org/drawingml/2006/picture">
+                <pic:pic xmlns:pic="http://schemas.openxmlformats.org/drawingml/2006/picture">
+                  <pic:nvPicPr>
+                    <pic:cNvPr id="0" name="" descr=""/>
+                    <pic:cNvPicPr>
+                      <a:picLocks noChangeAspect="1" noChangeArrowheads="1"/>
+                    </pic:cNvPicPr>
+                  </pic:nvPicPr>
+                  <pic:blipFill>
+                    <a:blip r:embed="rId17" cstate="none"/>
+                    <a:srcRect/>
+                    <a:stretch>
+                      <a:fillRect/>
+                    </a:stretch>
+                  </pic:blipFill>
+                  <pic:spPr bwMode="auto">
+                    <a:xfrm>
+                      <a:off x="0" y="0"/>
                       <a:ext cx="5715000" cy="2886075"/>
                     </a:xfrm>
                     <a:prstGeom prst="rect">
@@ -4091,7 +4099,6 @@
     </w:p>
     <w:p>
       <w:pPr>
-        <w:keepNext/>
         <w:spacing w:after="180"/>
         <w:jc w:val="center"/>
       </w:pPr>
@@ -4118,12 +4125,74 @@
         <w:rPr>
           <w:rFonts w:ascii="Courier New" w:cs="Courier New" w:eastAsia="Courier New" w:hAnsi="Courier New"/>
           <w:color w:val="1F4E5F"/>
-          <w:shd w:fill="E9F2F4" w:val="clear"/>
         </w:rPr>
         <w:t xml:space="preserve">INCONCLUSIVE</w:t>
       </w:r>
       <w:r>
         <w:t xml:space="preserve"> reproducible-simulation rows. It may describe modeled receipt-to-weight dynamics, but it is not demonstrated consensus security.</w:t>
+      </w:r>
+    </w:p>
+    <w:p>
+      <w:pPr>
+        <w:keepNext/>
+        <w:spacing w:after="80" w:before="140"/>
+        <w:jc w:val="center"/>
+      </w:pPr>
+      <w:r>
+        <w:drawing>
+          <wp:inline distT="0" distB="0" distL="0" distR="0">
+            <wp:extent cx="5715000" cy="3448050"/>
+            <wp:effectExtent t="0" r="0" b="0" l="0"/>
+            <wp:docPr id="1" name="F11_consensus_dynamics.png" descr="Figure 11. E8 modeled next-epoch attacker-weight thresholds across the frozen simulation scenarios. Probabilities are reproducible simulation outputs; they do not establish live-network or production consensus security, and E8 remains INCONCLUSIVE." title="Figure 11. E8 modeled next-epoch attacker-weight thresholds across the frozen simulation scenarios. Probabilities are reproducible simulation outputs; they do not establish live-network or production consensus security, and E8 remains INCONCLUSIVE."/>
+            <wp:cNvGraphicFramePr>
+              <a:graphicFrameLocks xmlns:a="http://schemas.openxmlformats.org/drawingml/2006/main" noChangeAspect="1"/>
+            </wp:cNvGraphicFramePr>
+            <a:graphic xmlns:a="http://schemas.openxmlformats.org/drawingml/2006/main">
+              <a:graphicData uri="http://schemas.openxmlformats.org/drawingml/2006/picture">
+                <pic:pic xmlns:pic="http://schemas.openxmlformats.org/drawingml/2006/picture">
+                  <pic:nvPicPr>
+                    <pic:cNvPr id="0" name="" descr=""/>
+                    <pic:cNvPicPr>
+                      <a:picLocks noChangeAspect="1" noChangeArrowheads="1"/>
+                    </pic:cNvPicPr>
+                  </pic:nvPicPr>
+                  <pic:blipFill>
+                    <a:blip r:embed="rId18" cstate="none"/>
+                    <a:srcRect/>
+                    <a:stretch>
+                      <a:fillRect/>
+                    </a:stretch>
+                  </pic:blipFill>
+                  <pic:spPr bwMode="auto">
+                    <a:xfrm>
+                      <a:off x="0" y="0"/>
+                      <a:ext cx="5715000" cy="3448050"/>
+                    </a:xfrm>
+                    <a:prstGeom prst="rect">
+                      <a:avLst/>
+                    </a:prstGeom>
+                  </pic:spPr>
+                </pic:pic>
+              </a:graphicData>
+            </a:graphic>
+          </wp:inline>
+        </w:drawing>
+      </w:r>
+    </w:p>
+    <w:p>
+      <w:pPr>
+        <w:spacing w:after="180"/>
+        <w:jc w:val="center"/>
+      </w:pPr>
+      <w:r>
+        <w:rPr>
+          <w:i/>
+          <w:iCs/>
+          <w:color w:val="3E4D53"/>
+          <w:sz w:val="18"/>
+          <w:szCs w:val="18"/>
+        </w:rPr>
+        <w:t xml:space="preserve">Figure 11. E8 modeled next-epoch attacker-weight thresholds across the frozen simulation scenarios. Probabilities are reproducible simulation outputs; they do not establish live-network or production consensus security, and E8 remains INCONCLUSIVE.</w:t>
       </w:r>
     </w:p>
     <w:p>
@@ -4410,7 +4479,6 @@
         <w:rPr>
           <w:rFonts w:ascii="Courier New" w:cs="Courier New" w:eastAsia="Courier New" w:hAnsi="Courier New"/>
           <w:color w:val="1F4E5F"/>
-          <w:shd w:fill="E9F2F4" w:val="clear"/>
         </w:rPr>
         <w:t xml:space="preserve">INCONCLUSIVE</w:t>
       </w:r>
@@ -4421,7 +4489,6 @@
         <w:rPr>
           <w:rFonts w:ascii="Courier New" w:cs="Courier New" w:eastAsia="Courier New" w:hAnsi="Courier New"/>
           <w:color w:val="1F4E5F"/>
-          <w:shd w:fill="E9F2F4" w:val="clear"/>
         </w:rPr>
         <w:t xml:space="preserve">WAITING_EXTERNAL</w:t>
       </w:r>
@@ -4604,7 +4671,6 @@
         <w:rPr>
           <w:rFonts w:ascii="Courier New" w:cs="Courier New" w:eastAsia="Courier New" w:hAnsi="Courier New"/>
           <w:color w:val="1F4E5F"/>
-          <w:shd w:fill="E9F2F4" w:val="clear"/>
         </w:rPr>
         <w:t xml:space="preserve">publication/artifact_manifest.json</w:t>
       </w:r>
@@ -4615,7 +4681,6 @@
         <w:rPr>
           <w:rFonts w:ascii="Courier New" w:cs="Courier New" w:eastAsia="Courier New" w:hAnsi="Courier New"/>
           <w:color w:val="1F4E5F"/>
-          <w:shd w:fill="E9F2F4" w:val="clear"/>
         </w:rPr>
         <w:t xml:space="preserve">7177d57747304d003160cdcb45bd572337028a8ffed8793dfa57e2d1444aaabf</w:t>
       </w:r>
@@ -4626,7 +4691,6 @@
         <w:rPr>
           <w:rFonts w:ascii="Courier New" w:cs="Courier New" w:eastAsia="Courier New" w:hAnsi="Courier New"/>
           <w:color w:val="1F4E5F"/>
-          <w:shd w:fill="E9F2F4" w:val="clear"/>
         </w:rPr>
         <w:t xml:space="preserve">scripts/build_paper_figures.py</w:t>
       </w:r>
@@ -4778,25 +4842,7 @@
         <w:spacing w:after="120" w:line="280"/>
       </w:pPr>
       <w:r>
-        <w:t xml:space="preserve">[11] Hearth. “A Verified-Inference Layer-1 Secured by Proof of Inference.” Source-carried draft whitepaper reference, July 2026. Grey literature; stable official primary source not verified in this manuscript pass.</w:t>
-      </w:r>
-    </w:p>
-    <w:p>
-      <w:pPr>
-        <w:widowControl/>
-        <w:spacing w:after="120" w:line="280"/>
-      </w:pPr>
-      <w:r>
-        <w:t xml:space="preserve">[12] Ambient. “Litepaper: Proof of Logits &amp; Verified Inference,” together with official product documentation describing “machine intelligence as currency,” accessed August 23, 2026. Grey literature.</w:t>
-      </w:r>
-    </w:p>
-    <w:p>
-      <w:pPr>
-        <w:widowControl/>
-        <w:spacing w:after="120" w:line="280"/>
-      </w:pPr>
-      <w:r>
-        <w:t xml:space="preserve">[13] M. Yu, S. Sahraei, S. Li, S. Avestimehr, S. Kannan, and P. Viswanath. “Coded Merkle Tree: Solving Data Availability Attacks in Blockchains.” In </w:t>
+        <w:t xml:space="preserve">[11] M. Yu, S. Sahraei, S. Li, S. Avestimehr, S. Kannan, and P. Viswanath. “Coded Merkle Tree: Solving Data Availability Attacks in Blockchains.” In </w:t>
       </w:r>
       <w:r>
         <w:rPr>
@@ -4815,7 +4861,7 @@
         <w:spacing w:after="120" w:line="280"/>
       </w:pPr>
       <w:r>
-        <w:t xml:space="preserve">[14] M. Yin, D. Malkhi, M. K. Reiter, G. G. Gueta, and I. Abraham. “HotStuff: BFT Consensus with Linearity and Responsiveness.” In </w:t>
+        <w:t xml:space="preserve">[12] M. Yin, D. Malkhi, M. K. Reiter, G. G. Gueta, and I. Abraham. “HotStuff: BFT Consensus with Linearity and Responsiveness.” In </w:t>
       </w:r>
       <w:r>
         <w:rPr>
@@ -4826,15 +4872,6 @@
       </w:r>
       <w:r>
         <w:t xml:space="preserve">, pp. 347-356, 2019.</w:t>
-      </w:r>
-    </w:p>
-    <w:p>
-      <w:pPr>
-        <w:widowControl/>
-        <w:spacing w:after="120" w:line="280"/>
-      </w:pPr>
-      <w:r>
-        <w:t xml:space="preserve">[15] Ethereum.org. “Node Architecture” and “Consensus Mechanisms,” accessed August 23, 2026.</w:t>
       </w:r>
     </w:p>
     <w:sectPr>

</xml_diff>

<commit_message>
docs: add evidence-bounded venue decision package
</commit_message>
<xml_diff>
--- a/docs/paper_artifacts/final/deliverables/POI_MPP_EVIDENCE_BOUND_MANUSCRIPT.docx
+++ b/docs/paper_artifacts/final/deliverables/POI_MPP_EVIDENCE_BOUND_MANUSCRIPT.docx
@@ -132,6 +132,22 @@
       </w:pPr>
       <w:r>
         <w:t xml:space="preserve">We evaluate a deliberately narrow Minimum Publishable Prototype (MPP) using a 1.5B open-weight model, local Foundry measurements, and reproducible experiments E1-E8. The current evidence is mixed and non-compensating. E1 and E2 are inconclusive real-model pilots; E4 and E8 are inconclusive simulations; E5 and E6 support only their frozen simulation scenarios; E7 supports local EVM boundedness; and E3 remains evidence-absent pending external evaluator authority. The strongest measured result is local Foundry boundedness: 15 operations or batch observations, a maximum observed gas value of 467,937, and a maximum configured-block-limit fraction of 0.0004358003. These results support feasibility of the narrow artifact-oriented MPP, not production consensus security, general semantic verification, or frontier-scale deployment.</w:t>
+      </w:r>
+    </w:p>
+    <w:p>
+      <w:pPr>
+        <w:widowControl/>
+        <w:spacing w:after="120" w:line="280"/>
+      </w:pPr>
+      <w:r>
+        <w:rPr>
+          <w:b/>
+          <w:bCs/>
+        </w:rPr>
+        <w:t xml:space="preserve">Keywords:</w:t>
+      </w:r>
+      <w:r>
+        <w:t xml:space="preserve"> proof of intelligence, verifiable AI inference, blockchain consensus, optimistic verification, evidence provenance, smart contracts</w:t>
       </w:r>
     </w:p>
     <w:p>

</xml_diff>

<commit_message>
Integrate attested E3 results into publication bundle
</commit_message>
<xml_diff>
--- a/docs/paper_artifacts/final/deliverables/POI_MPP_EVIDENCE_BOUND_MANUSCRIPT.docx
+++ b/docs/paper_artifacts/final/deliverables/POI_MPP_EVIDENCE_BOUND_MANUSCRIPT.docx
@@ -52,7 +52,7 @@
           <w:sz w:val="22"/>
           <w:szCs w:val="22"/>
         </w:rPr>
-        <w:t xml:space="preserve">NOT PUBLICATION-READY: E3 external evaluator authority, authenticated independent manual review, and the freeze sentinel remain open.</w:t>
+        <w:t xml:space="preserve">NOT PUBLICATION-READY: E3 is externally attested but C3 is NOT_SUPPORTED; evaluator identity/independence/key custody, authenticated independent review, and the freeze sentinel remain open.</w:t>
       </w:r>
     </w:p>
     <w:p>
@@ -81,7 +81,7 @@
           <w:sz w:val="17"/>
           <w:szCs w:val="17"/>
         </w:rPr>
-        <w:t xml:space="preserve">7177d57747304d003160cdcb45bd572337028a8ffed8793dfa57e2d1444aaabf</w:t>
+        <w:t xml:space="preserve">85c83c54f95f7f0b6cb58602dcdffa674b3ec2b6d251f85d23bceb31be44e9c0</w:t>
       </w:r>
     </w:p>
     <w:p>
@@ -131,7 +131,27 @@
         <w:spacing w:after="120" w:line="280"/>
       </w:pPr>
       <w:r>
-        <w:t xml:space="preserve">We evaluate a deliberately narrow Minimum Publishable Prototype (MPP) using a 1.5B open-weight model, local Foundry measurements, and reproducible experiments E1-E8. The current evidence is mixed and non-compensating. E1 and E2 are inconclusive real-model pilots; E4 and E8 are inconclusive simulations; E5 and E6 support only their frozen simulation scenarios; E7 supports local EVM boundedness; and E3 remains evidence-absent pending external evaluator authority. The strongest measured result is local Foundry boundedness: 15 operations or batch observations, a maximum observed gas value of 467,937, and a maximum configured-block-limit fraction of 0.0004358003. These results support feasibility of the narrow artifact-oriented MPP, not production consensus security, general semantic verification, or frontier-scale deployment.</w:t>
+        <w:t xml:space="preserve">We evaluate a deliberately narrow Minimum Publishable Prototype (MPP) using a 1.5B open-weight model, local Foundry measurements, and reproducible experiments E1-E8. The current evidence is mixed and non-compensating. E1 and E2 are inconclusive real-model pilots; E4 and E8 are inconclusive simulations; E5 and E6 support only their frozen simulation scenarios; E7 supports local EVM boundedness; and an externally authorized, post-execution-attested E3 real-model run produced a negative result. E3 measured FAR 0.500 (1/2), FRR 0.167 (1/6), ABSTAIN 0.125 (1/8), coverage 0.875 (7/8), and Brier calibration 0.178. Because FAR exceeded the frozen </w:t>
+      </w:r>
+      <w:r>
+        <w:rPr>
+          <w:rFonts w:ascii="Courier New" w:cs="Courier New" w:eastAsia="Courier New" w:hAnsi="Courier New"/>
+          <w:color w:val="1F4E5F"/>
+        </w:rPr>
+        <w:t xml:space="preserve">alpha_sem=0.25</w:t>
+      </w:r>
+      <w:r>
+        <w:t xml:space="preserve"> threshold, C3 is </w:t>
+      </w:r>
+      <w:r>
+        <w:rPr>
+          <w:rFonts w:ascii="Courier New" w:cs="Courier New" w:eastAsia="Courier New" w:hAnsi="Courier New"/>
+          <w:color w:val="1F4E5F"/>
+        </w:rPr>
+        <w:t xml:space="preserve">NOT_SUPPORTED</w:t>
+      </w:r>
+      <w:r>
+        <w:t xml:space="preserve">. The run contained only n=8 items, including invalid n=2, and does not establish general semantic reliability. The strongest positive measured result remains local Foundry boundedness: 15 operations or batch observations, a maximum observed gas value of 467,937, and a maximum configured-block-limit fraction of 0.0004358003. These results support feasibility of the narrow artifact-oriented MPP, not production consensus security, general semantic verification, or frontier-scale deployment.</w:t>
       </w:r>
     </w:p>
     <w:p>
@@ -2115,17 +2135,7 @@
         <w:spacing w:after="120" w:line="280"/>
       </w:pPr>
       <w:r>
-        <w:t xml:space="preserve">The canonical artifact manifest contains E1, E2, and E4-E8 result surfaces and records the E3 omission ledger. It does not make the manuscript publication-ready. E3 remains </w:t>
-      </w:r>
-      <w:r>
-        <w:rPr>
-          <w:rFonts w:ascii="Courier New" w:cs="Courier New" w:eastAsia="Courier New" w:hAnsi="Courier New"/>
-          <w:color w:val="1F4E5F"/>
-        </w:rPr>
-        <w:t xml:space="preserve">WAITING_EXTERNAL</w:t>
-      </w:r>
-      <w:r>
-        <w:t xml:space="preserve">, and the independent-review and freeze-sentinel gates remain open. These gate states are part of the scientific interpretation rather than formatting or administrative details.</w:t>
+        <w:t xml:space="preserve">The canonical artifact manifest contains E1-E8 result surfaces, including the externally attested negative E3 result, and contains no E3 omission after verified import. It does not make the manuscript publication-ready. E3 evaluator identity/independence/key-custody confirmation, independent review, and the freeze-sentinel gates remain open. These gate states are part of the scientific interpretation rather than formatting or administrative details.</w:t>
       </w:r>
     </w:p>
     <w:p>
@@ -2281,14 +2291,14 @@
         <w:t xml:space="preserve">INCONCLUSIVE</w:t>
       </w:r>
       <w:r>
-        <w:t xml:space="preserve">, E3 </w:t>
+        <w:t xml:space="preserve">, E3 C3 </w:t>
       </w:r>
       <w:r>
         <w:rPr>
           <w:rFonts w:ascii="Courier New" w:cs="Courier New" w:eastAsia="Courier New" w:hAnsi="Courier New"/>
           <w:color w:val="1F4E5F"/>
         </w:rPr>
-        <w:t xml:space="preserve">WAITING_EXTERNAL</w:t>
+        <w:t xml:space="preserve">NOT_SUPPORTED</w:t>
       </w:r>
       <w:r>
         <w:t xml:space="preserve">, C4 </w:t>
@@ -2831,7 +2841,7 @@
                 <w:sz w:val="18"/>
                 <w:szCs w:val="18"/>
               </w:rPr>
-              <w:t xml:space="preserve">Absent pending external authority</w:t>
+              <w:t xml:space="preserve">Externally attested negative real-model run</w:t>
             </w:r>
           </w:p>
         </w:tc>
@@ -2856,7 +2866,7 @@
                 <w:sz w:val="18"/>
                 <w:szCs w:val="18"/>
               </w:rPr>
-              <w:t xml:space="preserve">0</w:t>
+              <w:t xml:space="preserve">8</w:t>
             </w:r>
           </w:p>
         </w:tc>
@@ -2883,7 +2893,7 @@
                 <w:sz w:val="18"/>
                 <w:szCs w:val="18"/>
               </w:rPr>
-              <w:t xml:space="preserve">WAITING_EXTERNAL</w:t>
+              <w:t xml:space="preserve">NOT_SUPPORTED</w:t>
             </w:r>
           </w:p>
         </w:tc>
@@ -3778,65 +3788,46 @@
         <w:keepNext/>
       </w:pPr>
       <w:r>
-        <w:t xml:space="preserve">6.3 E3-E6: authority boundary and declared simulations</w:t>
-      </w:r>
-    </w:p>
-    <w:p>
-      <w:pPr>
-        <w:widowControl/>
-        <w:spacing w:after="120" w:line="280"/>
-      </w:pPr>
-      <w:r>
-        <w:t xml:space="preserve">E3 has no evidence artifact. T4, T8, and F7 are </w:t>
+        <w:t xml:space="preserve">6.3 E3-E6: negative semantic result and declared simulations</w:t>
+      </w:r>
+    </w:p>
+    <w:p>
+      <w:pPr>
+        <w:widowControl/>
+        <w:spacing w:after="120" w:line="280"/>
+      </w:pPr>
+      <w:r>
+        <w:t xml:space="preserve">E3 (T4, T8, F7) is an externally authorized and post-execution-attested </w:t>
       </w:r>
       <w:r>
         <w:rPr>
           <w:rFonts w:ascii="Courier New" w:cs="Courier New" w:eastAsia="Courier New" w:hAnsi="Courier New"/>
           <w:color w:val="1F4E5F"/>
         </w:rPr>
-        <w:t xml:space="preserve">WAITING_EXTERNAL</w:t>
-      </w:r>
-      <w:r>
-        <w:t xml:space="preserve"> because external evaluator authority has not been supplied. Semantic performance must not be reported before that gate is resolved.</w:t>
-      </w:r>
-    </w:p>
-    <w:p>
-      <w:pPr>
-        <w:widowControl/>
-        <w:spacing w:after="120" w:line="280"/>
-      </w:pPr>
-      <w:r>
-        <w:t xml:space="preserve">E4 (T9, F8) is an </w:t>
+        <w:t xml:space="preserve">REAL_MODEL_EXECUTION</w:t>
+      </w:r>
+      <w:r>
+        <w:t xml:space="preserve"> run. It measured FAR 0.500 (1/2), FRR 0.167 (1/6), ABSTAIN 0.125 (1/8), coverage 0.875 (7/8), and Brier calibration 0.178. The frozen decision rule is </w:t>
       </w:r>
       <w:r>
         <w:rPr>
           <w:rFonts w:ascii="Courier New" w:cs="Courier New" w:eastAsia="Courier New" w:hAnsi="Courier New"/>
           <w:color w:val="1F4E5F"/>
         </w:rPr>
-        <w:t xml:space="preserve">INCONCLUSIVE</w:t>
-      </w:r>
-      <w:r>
-        <w:t xml:space="preserve"> declared playback simulation, not executed reconstruction evidence. E5 (T10) is </w:t>
+        <w:t xml:space="preserve">alpha_sem=0.25</w:t>
+      </w:r>
+      <w:r>
+        <w:t xml:space="preserve">; because FAR exceeded that threshold, C3 is </w:t>
       </w:r>
       <w:r>
         <w:rPr>
           <w:rFonts w:ascii="Courier New" w:cs="Courier New" w:eastAsia="Courier New" w:hAnsi="Courier New"/>
           <w:color w:val="1F4E5F"/>
         </w:rPr>
-        <w:t xml:space="preserve">SUPPORTED</w:t>
-      </w:r>
-      <w:r>
-        <w:t xml:space="preserve"> only for its declared watcher/dispute-economic simulation scenarios and has no figure. E6 (T11, F9, F10) is </w:t>
-      </w:r>
-      <w:r>
-        <w:rPr>
-          <w:rFonts w:ascii="Courier New" w:cs="Courier New" w:eastAsia="Courier New" w:hAnsi="Courier New"/>
-          <w:color w:val="1F4E5F"/>
-        </w:rPr>
-        <w:t xml:space="preserve">SUPPORTED</w:t>
-      </w:r>
-      <w:r>
-        <w:t xml:space="preserve"> only for its declared Sybil/task-budget simulation scenarios. Neither E5 nor E6 supplies production or open-network evidence.</w:t>
+        <w:t xml:space="preserve">NOT_SUPPORTED</w:t>
+      </w:r>
+      <w:r>
+        <w:t xml:space="preserve">. The sample contained only n=8 items, including invalid n=2, so the run does not establish general semantic reliability. The cryptographic validity authenticates the signed authority/attestation bytes and exact artifact hashes; it does not prove the evaluator's real-world identity, independence, expertise, or private-key custody, which require accountable out-of-band confirmation.</w:t>
       </w:r>
     </w:p>
     <w:p>
@@ -3848,9 +3839,9 @@
       <w:r>
         <w:drawing>
           <wp:inline distT="0" distB="0" distL="0" distR="0">
-            <wp:extent cx="5715000" cy="3467100"/>
+            <wp:extent cx="5715000" cy="3219450"/>
             <wp:effectExtent t="0" r="0" b="0" l="0"/>
-            <wp:docPr id="1" name="F8_da_withholding.png" descr="Figure 8. E4 declared data-availability playback. The two scenario values and interval bounds are reproducible simulation outputs, not executed reconstruction or production DA evidence. The experiment remains INCONCLUSIVE." title="Figure 8. E4 declared data-availability playback. The two scenario values and interval bounds are reproducible simulation outputs, not executed reconstruction or production DA evidence. The experiment remains INCONCLUSIVE."/>
+            <wp:docPr id="1" name="F7_semantic_verification_quality.png" descr="Figure 7. E3 externally attested semantic-verification metrics. FAR was 0.500 on only two invalid items and exceeded the frozen 0.25 threshold; C3 is NOT_SUPPORTED. The eight-item run is a negative bounded result, not evidence of general semantic reliability. Source: canonical F7 SVG, T8, T4, and the verified import receipt." title="Figure 7. E3 externally attested semantic-verification metrics. FAR was 0.500 on only two invalid items and exceeded the frozen 0.25 threshold; C3 is NOT_SUPPORTED. The eight-item run is a negative bounded result, not evidence of general semantic reliability. Source: canonical F7 SVG, T8, T4, and the verified import receipt."/>
             <wp:cNvGraphicFramePr>
               <a:graphicFrameLocks xmlns:a="http://schemas.openxmlformats.org/drawingml/2006/main" noChangeAspect="1"/>
             </wp:cNvGraphicFramePr>
@@ -3873,7 +3864,7 @@
                   <pic:spPr bwMode="auto">
                     <a:xfrm>
                       <a:off x="0" y="0"/>
-                      <a:ext cx="5715000" cy="3467100"/>
+                      <a:ext cx="5715000" cy="3219450"/>
                     </a:xfrm>
                     <a:prstGeom prst="rect">
                       <a:avLst/>
@@ -3899,7 +3890,46 @@
           <w:sz w:val="18"/>
           <w:szCs w:val="18"/>
         </w:rPr>
-        <w:t xml:space="preserve">Figure 8. E4 declared data-availability playback. The two scenario values and interval bounds are reproducible simulation outputs, not executed reconstruction or production DA evidence. The experiment remains INCONCLUSIVE.</w:t>
+        <w:t xml:space="preserve">Figure 7. E3 externally attested semantic-verification metrics. FAR was 0.500 on only two invalid items and exceeded the frozen 0.25 threshold; C3 is NOT_SUPPORTED. The eight-item run is a negative bounded result, not evidence of general semantic reliability. Source: canonical F7 SVG, T8, T4, and the verified import receipt.</w:t>
+      </w:r>
+    </w:p>
+    <w:p>
+      <w:pPr>
+        <w:widowControl/>
+        <w:spacing w:after="120" w:line="280"/>
+      </w:pPr>
+      <w:r>
+        <w:t xml:space="preserve">E4 (T9, F8) is an </w:t>
+      </w:r>
+      <w:r>
+        <w:rPr>
+          <w:rFonts w:ascii="Courier New" w:cs="Courier New" w:eastAsia="Courier New" w:hAnsi="Courier New"/>
+          <w:color w:val="1F4E5F"/>
+        </w:rPr>
+        <w:t xml:space="preserve">INCONCLUSIVE</w:t>
+      </w:r>
+      <w:r>
+        <w:t xml:space="preserve"> declared playback simulation, not executed reconstruction evidence. E5 (T10) is </w:t>
+      </w:r>
+      <w:r>
+        <w:rPr>
+          <w:rFonts w:ascii="Courier New" w:cs="Courier New" w:eastAsia="Courier New" w:hAnsi="Courier New"/>
+          <w:color w:val="1F4E5F"/>
+        </w:rPr>
+        <w:t xml:space="preserve">SUPPORTED</w:t>
+      </w:r>
+      <w:r>
+        <w:t xml:space="preserve"> only for its declared watcher/dispute-economic simulation scenarios and has no figure. E6 (T11, F9, F10) is </w:t>
+      </w:r>
+      <w:r>
+        <w:rPr>
+          <w:rFonts w:ascii="Courier New" w:cs="Courier New" w:eastAsia="Courier New" w:hAnsi="Courier New"/>
+          <w:color w:val="1F4E5F"/>
+        </w:rPr>
+        <w:t xml:space="preserve">SUPPORTED</w:t>
+      </w:r>
+      <w:r>
+        <w:t xml:space="preserve"> only for its declared Sybil/task-budget simulation scenarios. Neither E5 nor E6 supplies production or open-network evidence.</w:t>
       </w:r>
     </w:p>
     <w:p>
@@ -3913,7 +3943,7 @@
           <wp:inline distT="0" distB="0" distL="0" distR="0">
             <wp:extent cx="5715000" cy="3467100"/>
             <wp:effectExtent t="0" r="0" b="0" l="0"/>
-            <wp:docPr id="1" name="F9_sybil_advantage.png" descr="Figure 9. E6 identity-splitting simulation. Capacity-committed and operator-slot rules remain normalized at one across the frozen one- and 64-identity scenarios; the intentionally identity-uniform negative control increases to 3.704. This is simulation evidence only." title="Figure 9. E6 identity-splitting simulation. Capacity-committed and operator-slot rules remain normalized at one across the frozen one- and 64-identity scenarios; the intentionally identity-uniform negative control increases to 3.704. This is simulation evidence only."/>
+            <wp:docPr id="1" name="F8_da_withholding.png" descr="Figure 8. E4 declared data-availability playback. The two scenario values and interval bounds are reproducible simulation outputs, not executed reconstruction or production DA evidence. The experiment remains INCONCLUSIVE." title="Figure 8. E4 declared data-availability playback. The two scenario values and interval bounds are reproducible simulation outputs, not executed reconstruction or production DA evidence. The experiment remains INCONCLUSIVE."/>
             <wp:cNvGraphicFramePr>
               <a:graphicFrameLocks xmlns:a="http://schemas.openxmlformats.org/drawingml/2006/main" noChangeAspect="1"/>
             </wp:cNvGraphicFramePr>
@@ -3962,7 +3992,7 @@
           <w:sz w:val="18"/>
           <w:szCs w:val="18"/>
         </w:rPr>
-        <w:t xml:space="preserve">Figure 9. E6 identity-splitting simulation. Capacity-committed and operator-slot rules remain normalized at one across the frozen one- and 64-identity scenarios; the intentionally identity-uniform negative control increases to 3.704. This is simulation evidence only.</w:t>
+        <w:t xml:space="preserve">Figure 8. E4 declared data-availability playback. The two scenario values and interval bounds are reproducible simulation outputs, not executed reconstruction or production DA evidence. The experiment remains INCONCLUSIVE.</w:t>
       </w:r>
     </w:p>
     <w:p>
@@ -3976,7 +4006,7 @@
           <wp:inline distT="0" distB="0" distL="0" distR="0">
             <wp:extent cx="5715000" cy="3467100"/>
             <wp:effectExtent t="0" r="0" b="0" l="0"/>
-            <wp:docPr id="1" name="F10_economic_security.png" descr="Figure 10. E6 modeled cost to one-third target weight under the frozen scenarios. Values are reproducible simulation outputs, not market prices, field measurements, or a production attack-cost guarantee." title="Figure 10. E6 modeled cost to one-third target weight under the frozen scenarios. Values are reproducible simulation outputs, not market prices, field measurements, or a production attack-cost guarantee."/>
+            <wp:docPr id="1" name="F9_sybil_advantage.png" descr="Figure 9. E6 identity-splitting simulation. Capacity-committed and operator-slot rules remain normalized at one across the frozen one- and 64-identity scenarios; the intentionally identity-uniform negative control increases to 3.704. This is simulation evidence only." title="Figure 9. E6 identity-splitting simulation. Capacity-committed and operator-slot rules remain normalized at one across the frozen one- and 64-identity scenarios; the intentionally identity-uniform negative control increases to 3.704. This is simulation evidence only."/>
             <wp:cNvGraphicFramePr>
               <a:graphicFrameLocks xmlns:a="http://schemas.openxmlformats.org/drawingml/2006/main" noChangeAspect="1"/>
             </wp:cNvGraphicFramePr>
@@ -4025,45 +4055,7 @@
           <w:sz w:val="18"/>
           <w:szCs w:val="18"/>
         </w:rPr>
-        <w:t xml:space="preserve">Figure 10. E6 modeled cost to one-third target weight under the frozen scenarios. Values are reproducible simulation outputs, not market prices, field measurements, or a production attack-cost guarantee.</w:t>
-      </w:r>
-    </w:p>
-    <w:p>
-      <w:pPr>
-        <w:pStyle w:val="Heading2"/>
-        <w:keepNext/>
-      </w:pPr>
-      <w:r>
-        <w:t xml:space="preserve">6.4 E7 and E8: local measurement and simulation</w:t>
-      </w:r>
-    </w:p>
-    <w:p>
-      <w:pPr>
-        <w:widowControl/>
-        <w:spacing w:after="120" w:line="280"/>
-      </w:pPr>
-      <w:r>
-        <w:t xml:space="preserve">E7 (T12, F12) contains 15 </w:t>
-      </w:r>
-      <w:r>
-        <w:rPr>
-          <w:rFonts w:ascii="Courier New" w:cs="Courier New" w:eastAsia="Courier New" w:hAnsi="Courier New"/>
-          <w:color w:val="1F4E5F"/>
-        </w:rPr>
-        <w:t xml:space="preserve">SUPPORTED</w:t>
-      </w:r>
-      <w:r>
-        <w:t xml:space="preserve"> local Foundry measurements. The largest observed gas value is 467937 for </w:t>
-      </w:r>
-      <w:r>
-        <w:rPr>
-          <w:rFonts w:ascii="Courier New" w:cs="Courier New" w:eastAsia="Courier New" w:hAnsi="Courier New"/>
-          <w:color w:val="1F4E5F"/>
-        </w:rPr>
-        <w:t xml:space="preserve">CREDIT_ALLOCATE</w:t>
-      </w:r>
-      <w:r>
-        <w:t xml:space="preserve"> at batch size 8, and the maximum fraction of the configured block limit is 0.00043580029159784317. This supports local boundedness only; it does not establish Ethereum-mainnet economics, production throughput, or production consensus performance.</w:t>
+        <w:t xml:space="preserve">Figure 9. E6 identity-splitting simulation. Capacity-committed and operator-slot rules remain normalized at one across the frozen one- and 64-identity scenarios; the intentionally identity-uniform negative control increases to 3.704. This is simulation evidence only.</w:t>
       </w:r>
     </w:p>
     <w:p>
@@ -4075,9 +4067,9 @@
       <w:r>
         <w:drawing>
           <wp:inline distT="0" distB="0" distL="0" distR="0">
-            <wp:extent cx="5715000" cy="2886075"/>
+            <wp:extent cx="5715000" cy="3467100"/>
             <wp:effectExtent t="0" r="0" b="0" l="0"/>
-            <wp:docPr id="1" name="F12_evm_gas_state_scaling.png" descr="Figure 12. E7 local Foundry gas measurements. The left panel reports batch-size-one operations; the right panel shows credit-allocation scaling through batch size eight. Maximum observed gas is 467,937. This supports local boundedness only." title="Figure 12. E7 local Foundry gas measurements. The left panel reports batch-size-one operations; the right panel shows credit-allocation scaling through batch size eight. Maximum observed gas is 467,937. This supports local boundedness only."/>
+            <wp:docPr id="1" name="F10_economic_security.png" descr="Figure 10. E6 modeled cost to one-third target weight under the frozen scenarios. Values are reproducible simulation outputs, not market prices, field measurements, or a production attack-cost guarantee." title="Figure 10. E6 modeled cost to one-third target weight under the frozen scenarios. Values are reproducible simulation outputs, not market prices, field measurements, or a production attack-cost guarantee."/>
             <wp:cNvGraphicFramePr>
               <a:graphicFrameLocks xmlns:a="http://schemas.openxmlformats.org/drawingml/2006/main" noChangeAspect="1"/>
             </wp:cNvGraphicFramePr>
@@ -4100,7 +4092,7 @@
                   <pic:spPr bwMode="auto">
                     <a:xfrm>
                       <a:off x="0" y="0"/>
-                      <a:ext cx="5715000" cy="2886075"/>
+                      <a:ext cx="5715000" cy="3467100"/>
                     </a:xfrm>
                     <a:prstGeom prst="rect">
                       <a:avLst/>
@@ -4126,26 +4118,45 @@
           <w:sz w:val="18"/>
           <w:szCs w:val="18"/>
         </w:rPr>
-        <w:t xml:space="preserve">Figure 12. E7 local Foundry gas measurements. The left panel reports batch-size-one operations; the right panel shows credit-allocation scaling through batch size eight. Maximum observed gas is 467,937. This supports local boundedness only.</w:t>
-      </w:r>
-    </w:p>
-    <w:p>
-      <w:pPr>
-        <w:widowControl/>
-        <w:spacing w:after="120" w:line="280"/>
-      </w:pPr>
-      <w:r>
-        <w:t xml:space="preserve">E8 (T13, F11) contains 10 </w:t>
+        <w:t xml:space="preserve">Figure 10. E6 modeled cost to one-third target weight under the frozen scenarios. Values are reproducible simulation outputs, not market prices, field measurements, or a production attack-cost guarantee.</w:t>
+      </w:r>
+    </w:p>
+    <w:p>
+      <w:pPr>
+        <w:pStyle w:val="Heading2"/>
+        <w:keepNext/>
+      </w:pPr>
+      <w:r>
+        <w:t xml:space="preserve">6.4 E7 and E8: local measurement and simulation</w:t>
+      </w:r>
+    </w:p>
+    <w:p>
+      <w:pPr>
+        <w:widowControl/>
+        <w:spacing w:after="120" w:line="280"/>
+      </w:pPr>
+      <w:r>
+        <w:t xml:space="preserve">E7 (T12, F12) contains 15 </w:t>
       </w:r>
       <w:r>
         <w:rPr>
           <w:rFonts w:ascii="Courier New" w:cs="Courier New" w:eastAsia="Courier New" w:hAnsi="Courier New"/>
           <w:color w:val="1F4E5F"/>
         </w:rPr>
-        <w:t xml:space="preserve">INCONCLUSIVE</w:t>
-      </w:r>
-      <w:r>
-        <w:t xml:space="preserve"> reproducible-simulation rows. It may describe modeled receipt-to-weight dynamics, but it is not demonstrated consensus security.</w:t>
+        <w:t xml:space="preserve">SUPPORTED</w:t>
+      </w:r>
+      <w:r>
+        <w:t xml:space="preserve"> local Foundry measurements. The largest observed gas value is 467937 for </w:t>
+      </w:r>
+      <w:r>
+        <w:rPr>
+          <w:rFonts w:ascii="Courier New" w:cs="Courier New" w:eastAsia="Courier New" w:hAnsi="Courier New"/>
+          <w:color w:val="1F4E5F"/>
+        </w:rPr>
+        <w:t xml:space="preserve">CREDIT_ALLOCATE</w:t>
+      </w:r>
+      <w:r>
+        <w:t xml:space="preserve"> at batch size 8, and the maximum fraction of the configured block limit is 0.00043580029159784317. This supports local boundedness only; it does not establish Ethereum-mainnet economics, production throughput, or production consensus performance.</w:t>
       </w:r>
     </w:p>
     <w:p>
@@ -4157,9 +4168,9 @@
       <w:r>
         <w:drawing>
           <wp:inline distT="0" distB="0" distL="0" distR="0">
-            <wp:extent cx="5715000" cy="3448050"/>
+            <wp:extent cx="5715000" cy="2886075"/>
             <wp:effectExtent t="0" r="0" b="0" l="0"/>
-            <wp:docPr id="1" name="F11_consensus_dynamics.png" descr="Figure 11. E8 modeled next-epoch attacker-weight thresholds across the frozen simulation scenarios. Probabilities are reproducible simulation outputs; they do not establish live-network or production consensus security, and E8 remains INCONCLUSIVE." title="Figure 11. E8 modeled next-epoch attacker-weight thresholds across the frozen simulation scenarios. Probabilities are reproducible simulation outputs; they do not establish live-network or production consensus security, and E8 remains INCONCLUSIVE."/>
+            <wp:docPr id="1" name="F12_evm_gas_state_scaling.png" descr="Figure 12. E7 local Foundry gas measurements. The left panel reports batch-size-one operations; the right panel shows credit-allocation scaling through batch size eight. Maximum observed gas is 467,937. This supports local boundedness only." title="Figure 12. E7 local Foundry gas measurements. The left panel reports batch-size-one operations; the right panel shows credit-allocation scaling through batch size eight. Maximum observed gas is 467,937. This supports local boundedness only."/>
             <wp:cNvGraphicFramePr>
               <a:graphicFrameLocks xmlns:a="http://schemas.openxmlformats.org/drawingml/2006/main" noChangeAspect="1"/>
             </wp:cNvGraphicFramePr>
@@ -4182,6 +4193,88 @@
                   <pic:spPr bwMode="auto">
                     <a:xfrm>
                       <a:off x="0" y="0"/>
+                      <a:ext cx="5715000" cy="2886075"/>
+                    </a:xfrm>
+                    <a:prstGeom prst="rect">
+                      <a:avLst/>
+                    </a:prstGeom>
+                  </pic:spPr>
+                </pic:pic>
+              </a:graphicData>
+            </a:graphic>
+          </wp:inline>
+        </w:drawing>
+      </w:r>
+    </w:p>
+    <w:p>
+      <w:pPr>
+        <w:spacing w:after="180"/>
+        <w:jc w:val="center"/>
+      </w:pPr>
+      <w:r>
+        <w:rPr>
+          <w:i/>
+          <w:iCs/>
+          <w:color w:val="3E4D53"/>
+          <w:sz w:val="18"/>
+          <w:szCs w:val="18"/>
+        </w:rPr>
+        <w:t xml:space="preserve">Figure 12. E7 local Foundry gas measurements. The left panel reports batch-size-one operations; the right panel shows credit-allocation scaling through batch size eight. Maximum observed gas is 467,937. This supports local boundedness only.</w:t>
+      </w:r>
+    </w:p>
+    <w:p>
+      <w:pPr>
+        <w:widowControl/>
+        <w:spacing w:after="120" w:line="280"/>
+      </w:pPr>
+      <w:r>
+        <w:t xml:space="preserve">E8 (T13, F11) contains 10 </w:t>
+      </w:r>
+      <w:r>
+        <w:rPr>
+          <w:rFonts w:ascii="Courier New" w:cs="Courier New" w:eastAsia="Courier New" w:hAnsi="Courier New"/>
+          <w:color w:val="1F4E5F"/>
+        </w:rPr>
+        <w:t xml:space="preserve">INCONCLUSIVE</w:t>
+      </w:r>
+      <w:r>
+        <w:t xml:space="preserve"> reproducible-simulation rows. It may describe modeled receipt-to-weight dynamics, but it is not demonstrated consensus security.</w:t>
+      </w:r>
+    </w:p>
+    <w:p>
+      <w:pPr>
+        <w:keepNext/>
+        <w:spacing w:after="80" w:before="140"/>
+        <w:jc w:val="center"/>
+      </w:pPr>
+      <w:r>
+        <w:drawing>
+          <wp:inline distT="0" distB="0" distL="0" distR="0">
+            <wp:extent cx="5715000" cy="3448050"/>
+            <wp:effectExtent t="0" r="0" b="0" l="0"/>
+            <wp:docPr id="1" name="F11_consensus_dynamics.png" descr="Figure 11. E8 modeled next-epoch attacker-weight thresholds across the frozen simulation scenarios. Probabilities are reproducible simulation outputs; they do not establish live-network or production consensus security, and E8 remains INCONCLUSIVE." title="Figure 11. E8 modeled next-epoch attacker-weight thresholds across the frozen simulation scenarios. Probabilities are reproducible simulation outputs; they do not establish live-network or production consensus security, and E8 remains INCONCLUSIVE."/>
+            <wp:cNvGraphicFramePr>
+              <a:graphicFrameLocks xmlns:a="http://schemas.openxmlformats.org/drawingml/2006/main" noChangeAspect="1"/>
+            </wp:cNvGraphicFramePr>
+            <a:graphic xmlns:a="http://schemas.openxmlformats.org/drawingml/2006/main">
+              <a:graphicData uri="http://schemas.openxmlformats.org/drawingml/2006/picture">
+                <pic:pic xmlns:pic="http://schemas.openxmlformats.org/drawingml/2006/picture">
+                  <pic:nvPicPr>
+                    <pic:cNvPr id="0" name="" descr=""/>
+                    <pic:cNvPicPr>
+                      <a:picLocks noChangeAspect="1" noChangeArrowheads="1"/>
+                    </pic:cNvPicPr>
+                  </pic:nvPicPr>
+                  <pic:blipFill>
+                    <a:blip r:embed="rId19" cstate="none"/>
+                    <a:srcRect/>
+                    <a:stretch>
+                      <a:fillRect/>
+                    </a:stretch>
+                  </pic:blipFill>
+                  <pic:spPr bwMode="auto">
+                    <a:xfrm>
+                      <a:off x="0" y="0"/>
                       <a:ext cx="5715000" cy="3448050"/>
                     </a:xfrm>
                     <a:prstGeom prst="rect">
@@ -4499,17 +4592,17 @@
         <w:t xml:space="preserve">INCONCLUSIVE</w:t>
       </w:r>
       <w:r>
-        <w:t xml:space="preserve">; E5 and E6 are supported only within declared simulation scenarios; and E7 is supported only for local Foundry boundedness. E3 is evidence-absent and </w:t>
+        <w:t xml:space="preserve">; E5 and E6 are supported only within declared simulation scenarios; and E7 is supported only for local Foundry boundedness. E3 is an externally attested real-model run, </w:t>
       </w:r>
       <w:r>
         <w:rPr>
           <w:rFonts w:ascii="Courier New" w:cs="Courier New" w:eastAsia="Courier New" w:hAnsi="Courier New"/>
           <w:color w:val="1F4E5F"/>
         </w:rPr>
-        <w:t xml:space="preserve">WAITING_EXTERNAL</w:t>
-      </w:r>
-      <w:r>
-        <w:t xml:space="preserve">.</w:t>
+        <w:t xml:space="preserve">NOT_SUPPORTED</w:t>
+      </w:r>
+      <w:r>
+        <w:t xml:space="preserve"> (FAR 0.500 &gt; alpha_sem 0.25).</w:t>
       </w:r>
     </w:p>
     <w:p>
@@ -4654,7 +4747,17 @@
         <w:spacing w:after="120" w:line="280"/>
       </w:pPr>
       <w:r>
-        <w:t xml:space="preserve">The current repository substantiates that this architecture can be reduced into a disciplined first-publication MPP. The strongest present repository-grounded result is local EVM boundedness (E7). E1 and E2 have canonical but inconclusive real-model pilot artifacts; E4 and E8 are inconclusive simulations; E5 and E6 are supported only within their declared simulations; and E3 remains blocked for external authority. The manuscript must preserve each boundary.</w:t>
+        <w:t xml:space="preserve">The current repository substantiates that this architecture can be reduced into a disciplined first-publication MPP. The strongest present positive repository-grounded result is local EVM boundedness (E7). E1 and E2 have canonical but inconclusive real-model pilot artifacts; E4 and E8 are inconclusive simulations; E5 and E6 are supported only within their declared simulations; and E3 is a canonical externally attested negative real-model result with C3 </w:t>
+      </w:r>
+      <w:r>
+        <w:rPr>
+          <w:rFonts w:ascii="Courier New" w:cs="Courier New" w:eastAsia="Courier New" w:hAnsi="Courier New"/>
+          <w:color w:val="1F4E5F"/>
+        </w:rPr>
+        <w:t xml:space="preserve">NOT_SUPPORTED</w:t>
+      </w:r>
+      <w:r>
+        <w:t xml:space="preserve">. The manuscript must preserve each boundary.</w:t>
       </w:r>
     </w:p>
     <w:p>
@@ -4720,7 +4823,7 @@
         <w:spacing w:after="120" w:line="280"/>
       </w:pPr>
       <w:r>
-        <w:t xml:space="preserve">The bundle is intentionally not frozen for submission. E3 external evaluator authority, authenticated independent manual review, and the freeze sentinel remain open. AI production, AI review, user approval, clean tests, and matching hashes do not by themselves constitute independent scientific review or authorize submission.</w:t>
+        <w:t xml:space="preserve">The bundle is intentionally not frozen for submission. E3 pre-execution authority and post-execution artifact attestation verify cryptographically, but real-world evaluator identity, independence, expertise, and private-key custody still require accountable out-of-band confirmation. Authenticated independent manual review and the freeze sentinel remain open. AI production, AI review, user approval, clean tests, and matching hashes do not by themselves constitute independent scientific review or authorize submission.</w:t>
       </w:r>
     </w:p>
     <w:p>

</xml_diff>

<commit_message>
Clarify E3 request context and rebuild manuscript
</commit_message>
<xml_diff>
--- a/docs/paper_artifacts/final/deliverables/POI_MPP_EVIDENCE_BOUND_MANUSCRIPT.docx
+++ b/docs/paper_artifacts/final/deliverables/POI_MPP_EVIDENCE_BOUND_MANUSCRIPT.docx
@@ -2117,7 +2117,17 @@
         <w:spacing w:after="120" w:line="280"/>
       </w:pPr>
       <w:r>
-        <w:t xml:space="preserve">Within its approved scope, the MPP software is materially implemented: evidence schemas, protocol objects, Python-Solidity parity surfaces, reporting builders, Foundry contract scaffolds, and a canonical publication-artifact pipeline are present. The manifest is the source of truth for result status; software implementation does not compensate for an inconclusive experiment, an absent authority, missing independent review, or an absent freeze sentinel.</w:t>
+        <w:t xml:space="preserve">Within its approved scope, the MPP software is materially implemented: evidence schemas, protocol objects, Python-Solidity parity surfaces, reporting builders, Foundry contract scaffolds, and a canonical publication-artifact pipeline are present. The manifest is the source of truth for result status; software implementation does not compensate for an inconclusive experiment, a missing authorization required for any future execution, missing independent review, or an absent freeze sentinel. The retained E3 run is not authority-blocked: its signed-revision pre-execution authorization and post-execution artifact attestation were verified, and its negative result remains </w:t>
+      </w:r>
+      <w:r>
+        <w:rPr>
+          <w:rFonts w:ascii="Courier New" w:cs="Courier New" w:eastAsia="Courier New" w:hAnsi="Courier New"/>
+          <w:color w:val="1F4E5F"/>
+        </w:rPr>
+        <w:t xml:space="preserve">C3=NOT_SUPPORTED</w:t>
+      </w:r>
+      <w:r>
+        <w:t xml:space="preserve">.</w:t>
       </w:r>
     </w:p>
     <w:p>
@@ -4424,7 +4434,17 @@
         <w:spacing w:after="60"/>
       </w:pPr>
       <w:r>
-        <w:t xml:space="preserve">external-evaluator-authorized semantic confirmation for E3;</w:t>
+        <w:t xml:space="preserve">general semantic reliability: the externally authorized and post-execution-attested E3 real-model run was negative under the frozen rule (</w:t>
+      </w:r>
+      <w:r>
+        <w:rPr>
+          <w:rFonts w:ascii="Courier New" w:cs="Courier New" w:eastAsia="Courier New" w:hAnsi="Courier New"/>
+          <w:color w:val="1F4E5F"/>
+        </w:rPr>
+        <w:t xml:space="preserve">C3=NOT_SUPPORTED</w:t>
+      </w:r>
+      <w:r>
+        <w:t xml:space="preserve">) and included only eight items, including two invalid items;</w:t>
       </w:r>
     </w:p>
     <w:p>
@@ -4611,7 +4631,7 @@
         <w:spacing w:after="120" w:line="280"/>
       </w:pPr>
       <w:r>
-        <w:t xml:space="preserve">Fifth, the canonical bundle remains not publication-ready because it preserves unresolved gates rather than relabeling them as success. External evaluator authority, authenticated independent manual review, and the publication-freeze sentinel remain required. Neither AI production nor user approval is independent review.</w:t>
+        <w:t xml:space="preserve">Fifth, the canonical bundle remains not publication-ready because it preserves unresolved gates rather than relabeling them as success. E3 pre-execution authority and its externally signed post-execution artifact attestation were verified for the hash-bound signed revision, but cryptographic validity alone does not prove the evaluator's real-world identity, independence, expertise, or private-key custody. Those out-of-band confirmations, authenticated independent manual review, and the publication-freeze sentinel remain required. Neither AI production nor user approval is independent review.</w:t>
       </w:r>
     </w:p>
     <w:p>
@@ -4784,7 +4804,7 @@
         <w:spacing w:after="120" w:line="280"/>
       </w:pPr>
       <w:r>
-        <w:t xml:space="preserve">The canonical report bundle is rooted at </w:t>
+        <w:t xml:space="preserve">The current candidate report bundle is rooted at </w:t>
       </w:r>
       <w:r>
         <w:rPr>
@@ -4801,16 +4821,26 @@
           <w:rFonts w:ascii="Courier New" w:cs="Courier New" w:eastAsia="Courier New" w:hAnsi="Courier New"/>
           <w:color w:val="1F4E5F"/>
         </w:rPr>
-        <w:t xml:space="preserve">7177d57747304d003160cdcb45bd572337028a8ffed8793dfa57e2d1444aaabf</w:t>
-      </w:r>
-      <w:r>
-        <w:t xml:space="preserve">. It contains machine-readable tables, quantitative SVG and JSON outputs, the claim matrix, and the omission ledger. Conceptual diagrams are retained as editable Mermaid source, and Algorithms 1-5 are retained as manuscript-ready pseudocode and detailed source specifications. Paper-only PNGs are deterministic presentation derivatives generated from canonical figure JSON by </w:t>
+        <w:t xml:space="preserve">85c83c54f95f7f0b6cb58602dcdffa674b3ec2b6d251f85d23bceb31be44e9c0</w:t>
+      </w:r>
+      <w:r>
+        <w:t xml:space="preserve">. It contains machine-readable tables, quantitative SVG and JSON outputs, the claim matrix, and the omission ledger. Integrated manifest validation currently fails closed because the recorded input hash for </w:t>
       </w:r>
       <w:r>
         <w:rPr>
           <w:rFonts w:ascii="Courier New" w:cs="Courier New" w:eastAsia="Courier New" w:hAnsi="Courier New"/>
           <w:color w:val="1F4E5F"/>
         </w:rPr>
+        <w:t xml:space="preserve">configs/publication_foundry/e7.run.yaml</w:t>
+      </w:r>
+      <w:r>
+        <w:t xml:space="preserve"> does not match the working input; therefore this candidate manifest is not a frozen publication bundle. Conceptual diagrams are retained as editable Mermaid source, and Algorithms 1-5 are retained as manuscript-ready pseudocode and detailed source specifications. Paper-only PNGs are deterministic presentation derivatives generated from canonical figure JSON by </w:t>
+      </w:r>
+      <w:r>
+        <w:rPr>
+          <w:rFonts w:ascii="Courier New" w:cs="Courier New" w:eastAsia="Courier New" w:hAnsi="Courier New"/>
+          <w:color w:val="1F4E5F"/>
+        </w:rPr>
         <w:t xml:space="preserve">scripts/build_paper_figures.py</w:t>
       </w:r>
       <w:r>
@@ -4823,7 +4853,7 @@
         <w:spacing w:after="120" w:line="280"/>
       </w:pPr>
       <w:r>
-        <w:t xml:space="preserve">The bundle is intentionally not frozen for submission. E3 pre-execution authority and post-execution artifact attestation verify cryptographically, but real-world evaluator identity, independence, expertise, and private-key custody still require accountable out-of-band confirmation. Authenticated independent manual review and the freeze sentinel remain open. AI production, AI review, user approval, clean tests, and matching hashes do not by themselves constitute independent scientific review or authorize submission.</w:t>
+        <w:t xml:space="preserve">The bundle is intentionally not frozen for submission. E3 pre-execution authority and post-execution artifact attestation were cryptographically verified for the hash-bound signed revision, but real-world evaluator identity, independence, expertise, and private-key custody still require accountable out-of-band confirmation. Authenticated independent manual review and the freeze sentinel remain open. AI production, AI review, user approval, clean tests, and matching hashes do not by themselves constitute independent scientific review or authorize submission.</w:t>
       </w:r>
     </w:p>
     <w:p>

</xml_diff>

<commit_message>
Synchronize manuscript and harden reproduction inputs
</commit_message>
<xml_diff>
--- a/docs/paper_artifacts/final/deliverables/POI_MPP_EVIDENCE_BOUND_MANUSCRIPT.docx
+++ b/docs/paper_artifacts/final/deliverables/POI_MPP_EVIDENCE_BOUND_MANUSCRIPT.docx
@@ -4821,20 +4821,10 @@
           <w:rFonts w:ascii="Courier New" w:cs="Courier New" w:eastAsia="Courier New" w:hAnsi="Courier New"/>
           <w:color w:val="1F4E5F"/>
         </w:rPr>
-        <w:t xml:space="preserve">85c83c54f95f7f0b6cb58602dcdffa674b3ec2b6d251f85d23bceb31be44e9c0</w:t>
-      </w:r>
-      <w:r>
-        <w:t xml:space="preserve">. It contains machine-readable tables, quantitative SVG and JSON outputs, the claim matrix, and the omission ledger. Integrated manifest validation currently fails closed because the recorded input hash for </w:t>
-      </w:r>
-      <w:r>
-        <w:rPr>
-          <w:rFonts w:ascii="Courier New" w:cs="Courier New" w:eastAsia="Courier New" w:hAnsi="Courier New"/>
-          <w:color w:val="1F4E5F"/>
-        </w:rPr>
-        <w:t xml:space="preserve">configs/publication_foundry/e7.run.yaml</w:t>
-      </w:r>
-      <w:r>
-        <w:t xml:space="preserve"> does not match the working input; therefore this candidate manifest is not a frozen publication bundle. Conceptual diagrams are retained as editable Mermaid source, and Algorithms 1-5 are retained as manuscript-ready pseudocode and detailed source specifications. Paper-only PNGs are deterministic presentation derivatives generated from canonical figure JSON by </w:t>
+        <w:t xml:space="preserve">1e8e57869d68bafdbcbdcf59a81e1f6d6c5d5089188a88f80a99d12748fcb722</w:t>
+      </w:r>
+      <w:r>
+        <w:t xml:space="preserve">. It contains machine-readable tables, quantitative SVG and JSON outputs, the claim matrix, and the omission ledger. Mechanical manifest validation passes against the current bound inputs. This verifies byte-level closure and deterministic binding only; it does not freeze the bundle or establish scientific validity. Conceptual diagrams are retained as editable Mermaid source, and Algorithms 1-5 are retained as manuscript-ready pseudocode and detailed source specifications. Paper-only PNGs are deterministic presentation derivatives generated from canonical figure JSON by </w:t>
       </w:r>
       <w:r>
         <w:rPr>

</xml_diff>